<commit_message>
Fix table widths to fit within two-column layout (3.25in per column)
Co-Authored-By: Claude Sonnet 4.6 <noreply@anthropic.com>
</commit_message>
<xml_diff>
--- a/final_paper.docx
+++ b/final_paper.docx
@@ -375,9 +375,9 @@
     <w:tbl>
       <w:tblPr>
         <w:tblStyle w:val="TableGrid"/>
-        <w:tblW w:type="auto" w:w="0"/>
         <w:jc w:val="center"/>
         <w:tblLook w:firstColumn="1" w:firstRow="1" w:lastColumn="0" w:lastRow="0" w:noHBand="0" w:noVBand="1" w:val="04A0"/>
+        <w:tblW w:w="4680" w:type="dxa"/>
       </w:tblPr>
       <w:tblGrid>
         <w:gridCol w:w="2520"/>
@@ -388,7 +388,7 @@
       <w:tr>
         <w:tc>
           <w:tcPr>
-            <w:tcW w:type="dxa" w:w="2520"/>
+            <w:tcW w:w="936" w:type="dxa"/>
           </w:tcPr>
           <w:p>
             <w:r>
@@ -403,7 +403,7 @@
         </w:tc>
         <w:tc>
           <w:tcPr>
-            <w:tcW w:type="dxa" w:w="2520"/>
+            <w:tcW w:w="1512" w:type="dxa"/>
           </w:tcPr>
           <w:p>
             <w:r>
@@ -418,7 +418,7 @@
         </w:tc>
         <w:tc>
           <w:tcPr>
-            <w:tcW w:type="dxa" w:w="2520"/>
+            <w:tcW w:w="936" w:type="dxa"/>
           </w:tcPr>
           <w:p>
             <w:r>
@@ -433,7 +433,7 @@
         </w:tc>
         <w:tc>
           <w:tcPr>
-            <w:tcW w:type="dxa" w:w="2520"/>
+            <w:tcW w:w="1296" w:type="dxa"/>
           </w:tcPr>
           <w:p>
             <w:r>
@@ -450,7 +450,7 @@
       <w:tr>
         <w:tc>
           <w:tcPr>
-            <w:tcW w:type="dxa" w:w="2520"/>
+            <w:tcW w:w="936" w:type="dxa"/>
           </w:tcPr>
           <w:p>
             <w:r>
@@ -464,7 +464,7 @@
         </w:tc>
         <w:tc>
           <w:tcPr>
-            <w:tcW w:type="dxa" w:w="2520"/>
+            <w:tcW w:w="1512" w:type="dxa"/>
           </w:tcPr>
           <w:p>
             <w:r>
@@ -478,7 +478,7 @@
         </w:tc>
         <w:tc>
           <w:tcPr>
-            <w:tcW w:type="dxa" w:w="2520"/>
+            <w:tcW w:w="936" w:type="dxa"/>
           </w:tcPr>
           <w:p>
             <w:r>
@@ -492,7 +492,7 @@
         </w:tc>
         <w:tc>
           <w:tcPr>
-            <w:tcW w:type="dxa" w:w="2520"/>
+            <w:tcW w:w="1296" w:type="dxa"/>
           </w:tcPr>
           <w:p>
             <w:r>
@@ -508,7 +508,7 @@
       <w:tr>
         <w:tc>
           <w:tcPr>
-            <w:tcW w:type="dxa" w:w="2520"/>
+            <w:tcW w:w="936" w:type="dxa"/>
           </w:tcPr>
           <w:p>
             <w:r>
@@ -522,7 +522,7 @@
         </w:tc>
         <w:tc>
           <w:tcPr>
-            <w:tcW w:type="dxa" w:w="2520"/>
+            <w:tcW w:w="1512" w:type="dxa"/>
           </w:tcPr>
           <w:p>
             <w:r>
@@ -536,7 +536,7 @@
         </w:tc>
         <w:tc>
           <w:tcPr>
-            <w:tcW w:type="dxa" w:w="2520"/>
+            <w:tcW w:w="936" w:type="dxa"/>
           </w:tcPr>
           <w:p>
             <w:r>
@@ -550,7 +550,7 @@
         </w:tc>
         <w:tc>
           <w:tcPr>
-            <w:tcW w:type="dxa" w:w="2520"/>
+            <w:tcW w:w="1296" w:type="dxa"/>
           </w:tcPr>
           <w:p>
             <w:r>
@@ -566,7 +566,7 @@
       <w:tr>
         <w:tc>
           <w:tcPr>
-            <w:tcW w:type="dxa" w:w="2520"/>
+            <w:tcW w:w="936" w:type="dxa"/>
           </w:tcPr>
           <w:p>
             <w:r>
@@ -580,7 +580,7 @@
         </w:tc>
         <w:tc>
           <w:tcPr>
-            <w:tcW w:type="dxa" w:w="2520"/>
+            <w:tcW w:w="1512" w:type="dxa"/>
           </w:tcPr>
           <w:p>
             <w:r>
@@ -594,7 +594,7 @@
         </w:tc>
         <w:tc>
           <w:tcPr>
-            <w:tcW w:type="dxa" w:w="2520"/>
+            <w:tcW w:w="936" w:type="dxa"/>
           </w:tcPr>
           <w:p>
             <w:r>
@@ -608,7 +608,7 @@
         </w:tc>
         <w:tc>
           <w:tcPr>
-            <w:tcW w:type="dxa" w:w="2520"/>
+            <w:tcW w:w="1296" w:type="dxa"/>
           </w:tcPr>
           <w:p>
             <w:r>
@@ -624,7 +624,7 @@
       <w:tr>
         <w:tc>
           <w:tcPr>
-            <w:tcW w:type="dxa" w:w="2520"/>
+            <w:tcW w:w="936" w:type="dxa"/>
           </w:tcPr>
           <w:p>
             <w:r>
@@ -638,7 +638,7 @@
         </w:tc>
         <w:tc>
           <w:tcPr>
-            <w:tcW w:type="dxa" w:w="2520"/>
+            <w:tcW w:w="1512" w:type="dxa"/>
           </w:tcPr>
           <w:p>
             <w:r>
@@ -652,7 +652,7 @@
         </w:tc>
         <w:tc>
           <w:tcPr>
-            <w:tcW w:type="dxa" w:w="2520"/>
+            <w:tcW w:w="936" w:type="dxa"/>
           </w:tcPr>
           <w:p>
             <w:r>
@@ -666,7 +666,7 @@
         </w:tc>
         <w:tc>
           <w:tcPr>
-            <w:tcW w:type="dxa" w:w="2520"/>
+            <w:tcW w:w="1296" w:type="dxa"/>
           </w:tcPr>
           <w:p>
             <w:r>
@@ -682,7 +682,7 @@
       <w:tr>
         <w:tc>
           <w:tcPr>
-            <w:tcW w:type="dxa" w:w="2520"/>
+            <w:tcW w:w="936" w:type="dxa"/>
           </w:tcPr>
           <w:p>
             <w:r>
@@ -696,7 +696,7 @@
         </w:tc>
         <w:tc>
           <w:tcPr>
-            <w:tcW w:type="dxa" w:w="2520"/>
+            <w:tcW w:w="1512" w:type="dxa"/>
           </w:tcPr>
           <w:p>
             <w:r>
@@ -710,7 +710,7 @@
         </w:tc>
         <w:tc>
           <w:tcPr>
-            <w:tcW w:type="dxa" w:w="2520"/>
+            <w:tcW w:w="936" w:type="dxa"/>
           </w:tcPr>
           <w:p>
             <w:r>
@@ -724,7 +724,7 @@
         </w:tc>
         <w:tc>
           <w:tcPr>
-            <w:tcW w:type="dxa" w:w="2520"/>
+            <w:tcW w:w="1296" w:type="dxa"/>
           </w:tcPr>
           <w:p>
             <w:r>
@@ -740,7 +740,7 @@
       <w:tr>
         <w:tc>
           <w:tcPr>
-            <w:tcW w:type="dxa" w:w="2520"/>
+            <w:tcW w:w="936" w:type="dxa"/>
           </w:tcPr>
           <w:p>
             <w:r>
@@ -754,7 +754,7 @@
         </w:tc>
         <w:tc>
           <w:tcPr>
-            <w:tcW w:type="dxa" w:w="2520"/>
+            <w:tcW w:w="1512" w:type="dxa"/>
           </w:tcPr>
           <w:p>
             <w:r>
@@ -768,7 +768,7 @@
         </w:tc>
         <w:tc>
           <w:tcPr>
-            <w:tcW w:type="dxa" w:w="2520"/>
+            <w:tcW w:w="936" w:type="dxa"/>
           </w:tcPr>
           <w:p>
             <w:r>
@@ -782,7 +782,7 @@
         </w:tc>
         <w:tc>
           <w:tcPr>
-            <w:tcW w:type="dxa" w:w="2520"/>
+            <w:tcW w:w="1296" w:type="dxa"/>
           </w:tcPr>
           <w:p>
             <w:r>
@@ -798,7 +798,7 @@
       <w:tr>
         <w:tc>
           <w:tcPr>
-            <w:tcW w:type="dxa" w:w="2520"/>
+            <w:tcW w:w="936" w:type="dxa"/>
           </w:tcPr>
           <w:p>
             <w:r>
@@ -812,7 +812,7 @@
         </w:tc>
         <w:tc>
           <w:tcPr>
-            <w:tcW w:type="dxa" w:w="2520"/>
+            <w:tcW w:w="1512" w:type="dxa"/>
           </w:tcPr>
           <w:p>
             <w:r>
@@ -826,7 +826,7 @@
         </w:tc>
         <w:tc>
           <w:tcPr>
-            <w:tcW w:type="dxa" w:w="2520"/>
+            <w:tcW w:w="936" w:type="dxa"/>
           </w:tcPr>
           <w:p>
             <w:r>
@@ -840,7 +840,7 @@
         </w:tc>
         <w:tc>
           <w:tcPr>
-            <w:tcW w:type="dxa" w:w="2520"/>
+            <w:tcW w:w="1296" w:type="dxa"/>
           </w:tcPr>
           <w:p>
             <w:r>
@@ -856,7 +856,7 @@
       <w:tr>
         <w:tc>
           <w:tcPr>
-            <w:tcW w:type="dxa" w:w="2520"/>
+            <w:tcW w:w="936" w:type="dxa"/>
           </w:tcPr>
           <w:p>
             <w:r>
@@ -870,7 +870,7 @@
         </w:tc>
         <w:tc>
           <w:tcPr>
-            <w:tcW w:type="dxa" w:w="2520"/>
+            <w:tcW w:w="1512" w:type="dxa"/>
           </w:tcPr>
           <w:p>
             <w:r>
@@ -884,7 +884,7 @@
         </w:tc>
         <w:tc>
           <w:tcPr>
-            <w:tcW w:type="dxa" w:w="2520"/>
+            <w:tcW w:w="936" w:type="dxa"/>
           </w:tcPr>
           <w:p>
             <w:r>
@@ -898,7 +898,7 @@
         </w:tc>
         <w:tc>
           <w:tcPr>
-            <w:tcW w:type="dxa" w:w="2520"/>
+            <w:tcW w:w="1296" w:type="dxa"/>
           </w:tcPr>
           <w:p>
             <w:r>
@@ -914,7 +914,7 @@
       <w:tr>
         <w:tc>
           <w:tcPr>
-            <w:tcW w:type="dxa" w:w="2520"/>
+            <w:tcW w:w="936" w:type="dxa"/>
           </w:tcPr>
           <w:p>
             <w:r>
@@ -928,7 +928,7 @@
         </w:tc>
         <w:tc>
           <w:tcPr>
-            <w:tcW w:type="dxa" w:w="2520"/>
+            <w:tcW w:w="1512" w:type="dxa"/>
           </w:tcPr>
           <w:p>
             <w:r>
@@ -942,7 +942,7 @@
         </w:tc>
         <w:tc>
           <w:tcPr>
-            <w:tcW w:type="dxa" w:w="2520"/>
+            <w:tcW w:w="936" w:type="dxa"/>
           </w:tcPr>
           <w:p>
             <w:r>
@@ -956,7 +956,7 @@
         </w:tc>
         <w:tc>
           <w:tcPr>
-            <w:tcW w:type="dxa" w:w="2520"/>
+            <w:tcW w:w="1296" w:type="dxa"/>
           </w:tcPr>
           <w:p>
             <w:r>
@@ -1377,9 +1377,9 @@
     <w:tbl>
       <w:tblPr>
         <w:tblStyle w:val="TableGrid"/>
-        <w:tblW w:type="auto" w:w="0"/>
         <w:jc w:val="center"/>
         <w:tblLook w:firstColumn="1" w:firstRow="1" w:lastColumn="0" w:lastRow="0" w:noHBand="0" w:noVBand="1" w:val="04A0"/>
+        <w:tblW w:w="4680" w:type="dxa"/>
       </w:tblPr>
       <w:tblGrid>
         <w:gridCol w:w="2520"/>
@@ -1390,7 +1390,7 @@
       <w:tr>
         <w:tc>
           <w:tcPr>
-            <w:tcW w:type="dxa" w:w="2520"/>
+            <w:tcW w:w="1152" w:type="dxa"/>
           </w:tcPr>
           <w:p>
             <w:r>
@@ -1405,7 +1405,7 @@
         </w:tc>
         <w:tc>
           <w:tcPr>
-            <w:tcW w:type="dxa" w:w="2520"/>
+            <w:tcW w:w="1224" w:type="dxa"/>
           </w:tcPr>
           <w:p>
             <w:r>
@@ -1420,7 +1420,7 @@
         </w:tc>
         <w:tc>
           <w:tcPr>
-            <w:tcW w:type="dxa" w:w="2520"/>
+            <w:tcW w:w="1080" w:type="dxa"/>
           </w:tcPr>
           <w:p>
             <w:r>
@@ -1435,7 +1435,7 @@
         </w:tc>
         <w:tc>
           <w:tcPr>
-            <w:tcW w:type="dxa" w:w="2520"/>
+            <w:tcW w:w="1224" w:type="dxa"/>
           </w:tcPr>
           <w:p>
             <w:r>
@@ -1452,7 +1452,7 @@
       <w:tr>
         <w:tc>
           <w:tcPr>
-            <w:tcW w:type="dxa" w:w="2520"/>
+            <w:tcW w:w="1152" w:type="dxa"/>
           </w:tcPr>
           <w:p>
             <w:r>
@@ -1467,7 +1467,7 @@
         </w:tc>
         <w:tc>
           <w:tcPr>
-            <w:tcW w:type="dxa" w:w="2520"/>
+            <w:tcW w:w="1224" w:type="dxa"/>
           </w:tcPr>
           <w:p>
             <w:r>
@@ -1482,7 +1482,7 @@
         </w:tc>
         <w:tc>
           <w:tcPr>
-            <w:tcW w:type="dxa" w:w="2520"/>
+            <w:tcW w:w="1080" w:type="dxa"/>
           </w:tcPr>
           <w:p>
             <w:r>
@@ -1497,7 +1497,7 @@
         </w:tc>
         <w:tc>
           <w:tcPr>
-            <w:tcW w:type="dxa" w:w="2520"/>
+            <w:tcW w:w="1224" w:type="dxa"/>
           </w:tcPr>
           <w:p>
             <w:r>
@@ -1514,7 +1514,7 @@
       <w:tr>
         <w:tc>
           <w:tcPr>
-            <w:tcW w:type="dxa" w:w="2520"/>
+            <w:tcW w:w="1152" w:type="dxa"/>
           </w:tcPr>
           <w:p>
             <w:r>
@@ -1529,7 +1529,7 @@
         </w:tc>
         <w:tc>
           <w:tcPr>
-            <w:tcW w:type="dxa" w:w="2520"/>
+            <w:tcW w:w="1224" w:type="dxa"/>
           </w:tcPr>
           <w:p>
             <w:r>
@@ -1544,7 +1544,7 @@
         </w:tc>
         <w:tc>
           <w:tcPr>
-            <w:tcW w:type="dxa" w:w="2520"/>
+            <w:tcW w:w="1080" w:type="dxa"/>
           </w:tcPr>
           <w:p>
             <w:r>
@@ -1559,7 +1559,7 @@
         </w:tc>
         <w:tc>
           <w:tcPr>
-            <w:tcW w:type="dxa" w:w="2520"/>
+            <w:tcW w:w="1224" w:type="dxa"/>
           </w:tcPr>
           <w:p>
             <w:r>
@@ -1576,7 +1576,7 @@
       <w:tr>
         <w:tc>
           <w:tcPr>
-            <w:tcW w:type="dxa" w:w="2520"/>
+            <w:tcW w:w="1152" w:type="dxa"/>
           </w:tcPr>
           <w:p>
             <w:r>
@@ -1591,7 +1591,7 @@
         </w:tc>
         <w:tc>
           <w:tcPr>
-            <w:tcW w:type="dxa" w:w="2520"/>
+            <w:tcW w:w="1224" w:type="dxa"/>
           </w:tcPr>
           <w:p>
             <w:r>
@@ -1606,7 +1606,7 @@
         </w:tc>
         <w:tc>
           <w:tcPr>
-            <w:tcW w:type="dxa" w:w="2520"/>
+            <w:tcW w:w="1080" w:type="dxa"/>
           </w:tcPr>
           <w:p>
             <w:r>
@@ -1621,7 +1621,7 @@
         </w:tc>
         <w:tc>
           <w:tcPr>
-            <w:tcW w:type="dxa" w:w="2520"/>
+            <w:tcW w:w="1224" w:type="dxa"/>
           </w:tcPr>
           <w:p>
             <w:r>
@@ -1693,9 +1693,9 @@
     <w:tbl>
       <w:tblPr>
         <w:tblStyle w:val="TableGrid"/>
-        <w:tblW w:type="auto" w:w="0"/>
         <w:jc w:val="center"/>
         <w:tblLook w:firstColumn="1" w:firstRow="1" w:lastColumn="0" w:lastRow="0" w:noHBand="0" w:noVBand="1" w:val="04A0"/>
+        <w:tblW w:w="4680" w:type="dxa"/>
       </w:tblPr>
       <w:tblGrid>
         <w:gridCol w:w="3360"/>
@@ -1705,7 +1705,7 @@
       <w:tr>
         <w:tc>
           <w:tcPr>
-            <w:tcW w:type="dxa" w:w="3360"/>
+            <w:tcW w:w="2232" w:type="dxa"/>
           </w:tcPr>
           <w:p>
             <w:r>
@@ -1720,7 +1720,7 @@
         </w:tc>
         <w:tc>
           <w:tcPr>
-            <w:tcW w:type="dxa" w:w="3360"/>
+            <w:tcW w:w="1224" w:type="dxa"/>
           </w:tcPr>
           <w:p>
             <w:r>
@@ -1735,7 +1735,7 @@
         </w:tc>
         <w:tc>
           <w:tcPr>
-            <w:tcW w:type="dxa" w:w="3360"/>
+            <w:tcW w:w="1224" w:type="dxa"/>
           </w:tcPr>
           <w:p>
             <w:r>
@@ -1752,7 +1752,7 @@
       <w:tr>
         <w:tc>
           <w:tcPr>
-            <w:tcW w:type="dxa" w:w="3360"/>
+            <w:tcW w:w="2232" w:type="dxa"/>
           </w:tcPr>
           <w:p>
             <w:r>
@@ -1767,7 +1767,7 @@
         </w:tc>
         <w:tc>
           <w:tcPr>
-            <w:tcW w:type="dxa" w:w="3360"/>
+            <w:tcW w:w="1224" w:type="dxa"/>
           </w:tcPr>
           <w:p>
             <w:r>
@@ -1782,7 +1782,7 @@
         </w:tc>
         <w:tc>
           <w:tcPr>
-            <w:tcW w:type="dxa" w:w="3360"/>
+            <w:tcW w:w="1224" w:type="dxa"/>
           </w:tcPr>
           <w:p>
             <w:r>
@@ -1799,7 +1799,7 @@
       <w:tr>
         <w:tc>
           <w:tcPr>
-            <w:tcW w:type="dxa" w:w="3360"/>
+            <w:tcW w:w="2232" w:type="dxa"/>
           </w:tcPr>
           <w:p>
             <w:r>
@@ -1814,7 +1814,7 @@
         </w:tc>
         <w:tc>
           <w:tcPr>
-            <w:tcW w:type="dxa" w:w="3360"/>
+            <w:tcW w:w="1224" w:type="dxa"/>
           </w:tcPr>
           <w:p>
             <w:r>
@@ -1829,7 +1829,7 @@
         </w:tc>
         <w:tc>
           <w:tcPr>
-            <w:tcW w:type="dxa" w:w="3360"/>
+            <w:tcW w:w="1224" w:type="dxa"/>
           </w:tcPr>
           <w:p>
             <w:r>
@@ -1846,7 +1846,7 @@
       <w:tr>
         <w:tc>
           <w:tcPr>
-            <w:tcW w:type="dxa" w:w="3360"/>
+            <w:tcW w:w="2232" w:type="dxa"/>
           </w:tcPr>
           <w:p>
             <w:r>
@@ -1861,7 +1861,7 @@
         </w:tc>
         <w:tc>
           <w:tcPr>
-            <w:tcW w:type="dxa" w:w="3360"/>
+            <w:tcW w:w="1224" w:type="dxa"/>
           </w:tcPr>
           <w:p>
             <w:r>
@@ -1876,7 +1876,7 @@
         </w:tc>
         <w:tc>
           <w:tcPr>
-            <w:tcW w:type="dxa" w:w="3360"/>
+            <w:tcW w:w="1224" w:type="dxa"/>
           </w:tcPr>
           <w:p>
             <w:r>
@@ -1893,7 +1893,7 @@
       <w:tr>
         <w:tc>
           <w:tcPr>
-            <w:tcW w:type="dxa" w:w="3360"/>
+            <w:tcW w:w="2232" w:type="dxa"/>
           </w:tcPr>
           <w:p>
             <w:r>
@@ -1908,7 +1908,7 @@
         </w:tc>
         <w:tc>
           <w:tcPr>
-            <w:tcW w:type="dxa" w:w="3360"/>
+            <w:tcW w:w="1224" w:type="dxa"/>
           </w:tcPr>
           <w:p>
             <w:r>
@@ -1923,7 +1923,7 @@
         </w:tc>
         <w:tc>
           <w:tcPr>
-            <w:tcW w:type="dxa" w:w="3360"/>
+            <w:tcW w:w="1224" w:type="dxa"/>
           </w:tcPr>
           <w:p>
             <w:r>
@@ -1940,7 +1940,7 @@
       <w:tr>
         <w:tc>
           <w:tcPr>
-            <w:tcW w:type="dxa" w:w="3360"/>
+            <w:tcW w:w="2232" w:type="dxa"/>
           </w:tcPr>
           <w:p>
             <w:r>
@@ -1955,7 +1955,7 @@
         </w:tc>
         <w:tc>
           <w:tcPr>
-            <w:tcW w:type="dxa" w:w="3360"/>
+            <w:tcW w:w="1224" w:type="dxa"/>
           </w:tcPr>
           <w:p>
             <w:r>
@@ -1970,7 +1970,7 @@
         </w:tc>
         <w:tc>
           <w:tcPr>
-            <w:tcW w:type="dxa" w:w="3360"/>
+            <w:tcW w:w="1224" w:type="dxa"/>
           </w:tcPr>
           <w:p>
             <w:r>
@@ -2042,9 +2042,9 @@
     <w:tbl>
       <w:tblPr>
         <w:tblStyle w:val="TableGrid"/>
-        <w:tblW w:type="auto" w:w="0"/>
         <w:jc w:val="center"/>
         <w:tblLook w:firstColumn="1" w:firstRow="1" w:lastColumn="0" w:lastRow="0" w:noHBand="0" w:noVBand="1" w:val="04A0"/>
+        <w:tblW w:w="4680" w:type="dxa"/>
       </w:tblPr>
       <w:tblGrid>
         <w:gridCol w:w="5040"/>
@@ -2053,7 +2053,7 @@
       <w:tr>
         <w:tc>
           <w:tcPr>
-            <w:tcW w:type="dxa" w:w="5040"/>
+            <w:tcW w:w="3240" w:type="dxa"/>
           </w:tcPr>
           <w:p>
             <w:r>
@@ -2068,7 +2068,7 @@
         </w:tc>
         <w:tc>
           <w:tcPr>
-            <w:tcW w:type="dxa" w:w="5040"/>
+            <w:tcW w:w="1440" w:type="dxa"/>
           </w:tcPr>
           <w:p>
             <w:r>
@@ -2085,7 +2085,7 @@
       <w:tr>
         <w:tc>
           <w:tcPr>
-            <w:tcW w:type="dxa" w:w="5040"/>
+            <w:tcW w:w="3240" w:type="dxa"/>
           </w:tcPr>
           <w:p>
             <w:r>
@@ -2100,7 +2100,7 @@
         </w:tc>
         <w:tc>
           <w:tcPr>
-            <w:tcW w:type="dxa" w:w="5040"/>
+            <w:tcW w:w="1440" w:type="dxa"/>
           </w:tcPr>
           <w:p>
             <w:r>
@@ -2117,7 +2117,7 @@
       <w:tr>
         <w:tc>
           <w:tcPr>
-            <w:tcW w:type="dxa" w:w="5040"/>
+            <w:tcW w:w="3240" w:type="dxa"/>
           </w:tcPr>
           <w:p>
             <w:r>
@@ -2132,7 +2132,7 @@
         </w:tc>
         <w:tc>
           <w:tcPr>
-            <w:tcW w:type="dxa" w:w="5040"/>
+            <w:tcW w:w="1440" w:type="dxa"/>
           </w:tcPr>
           <w:p>
             <w:r>
@@ -2149,7 +2149,7 @@
       <w:tr>
         <w:tc>
           <w:tcPr>
-            <w:tcW w:type="dxa" w:w="5040"/>
+            <w:tcW w:w="3240" w:type="dxa"/>
           </w:tcPr>
           <w:p>
             <w:r>
@@ -2164,7 +2164,7 @@
         </w:tc>
         <w:tc>
           <w:tcPr>
-            <w:tcW w:type="dxa" w:w="5040"/>
+            <w:tcW w:w="1440" w:type="dxa"/>
           </w:tcPr>
           <w:p>
             <w:r>
@@ -2181,7 +2181,7 @@
       <w:tr>
         <w:tc>
           <w:tcPr>
-            <w:tcW w:type="dxa" w:w="5040"/>
+            <w:tcW w:w="3240" w:type="dxa"/>
           </w:tcPr>
           <w:p>
             <w:r>
@@ -2196,7 +2196,7 @@
         </w:tc>
         <w:tc>
           <w:tcPr>
-            <w:tcW w:type="dxa" w:w="5040"/>
+            <w:tcW w:w="1440" w:type="dxa"/>
           </w:tcPr>
           <w:p>
             <w:r>
@@ -2213,7 +2213,7 @@
       <w:tr>
         <w:tc>
           <w:tcPr>
-            <w:tcW w:type="dxa" w:w="5040"/>
+            <w:tcW w:w="3240" w:type="dxa"/>
           </w:tcPr>
           <w:p>
             <w:r>
@@ -2228,7 +2228,7 @@
         </w:tc>
         <w:tc>
           <w:tcPr>
-            <w:tcW w:type="dxa" w:w="5040"/>
+            <w:tcW w:w="1440" w:type="dxa"/>
           </w:tcPr>
           <w:p>
             <w:r>
@@ -2245,7 +2245,7 @@
       <w:tr>
         <w:tc>
           <w:tcPr>
-            <w:tcW w:type="dxa" w:w="5040"/>
+            <w:tcW w:w="3240" w:type="dxa"/>
           </w:tcPr>
           <w:p>
             <w:r>
@@ -2260,7 +2260,7 @@
         </w:tc>
         <w:tc>
           <w:tcPr>
-            <w:tcW w:type="dxa" w:w="5040"/>
+            <w:tcW w:w="1440" w:type="dxa"/>
           </w:tcPr>
           <w:p>
             <w:r>
@@ -2277,7 +2277,7 @@
       <w:tr>
         <w:tc>
           <w:tcPr>
-            <w:tcW w:type="dxa" w:w="5040"/>
+            <w:tcW w:w="3240" w:type="dxa"/>
           </w:tcPr>
           <w:p>
             <w:r>
@@ -2292,7 +2292,7 @@
         </w:tc>
         <w:tc>
           <w:tcPr>
-            <w:tcW w:type="dxa" w:w="5040"/>
+            <w:tcW w:w="1440" w:type="dxa"/>
           </w:tcPr>
           <w:p>
             <w:r>
@@ -2404,9 +2404,9 @@
     <w:tbl>
       <w:tblPr>
         <w:tblStyle w:val="TableGrid"/>
-        <w:tblW w:type="auto" w:w="0"/>
         <w:jc w:val="center"/>
         <w:tblLook w:firstColumn="1" w:firstRow="1" w:lastColumn="0" w:lastRow="0" w:noHBand="0" w:noVBand="1" w:val="04A0"/>
+        <w:tblW w:w="4680" w:type="dxa"/>
       </w:tblPr>
       <w:tblGrid>
         <w:gridCol w:w="2520"/>
@@ -2417,7 +2417,7 @@
       <w:tr>
         <w:tc>
           <w:tcPr>
-            <w:tcW w:type="dxa" w:w="2520"/>
+            <w:tcW w:w="1080" w:type="dxa"/>
           </w:tcPr>
           <w:p>
             <w:r>
@@ -2432,7 +2432,7 @@
         </w:tc>
         <w:tc>
           <w:tcPr>
-            <w:tcW w:type="dxa" w:w="2520"/>
+            <w:tcW w:w="1224" w:type="dxa"/>
           </w:tcPr>
           <w:p>
             <w:r>
@@ -2447,7 +2447,7 @@
         </w:tc>
         <w:tc>
           <w:tcPr>
-            <w:tcW w:type="dxa" w:w="2520"/>
+            <w:tcW w:w="1080" w:type="dxa"/>
           </w:tcPr>
           <w:p>
             <w:r>
@@ -2462,7 +2462,7 @@
         </w:tc>
         <w:tc>
           <w:tcPr>
-            <w:tcW w:type="dxa" w:w="2520"/>
+            <w:tcW w:w="1296" w:type="dxa"/>
           </w:tcPr>
           <w:p>
             <w:r>
@@ -2479,7 +2479,7 @@
       <w:tr>
         <w:tc>
           <w:tcPr>
-            <w:tcW w:type="dxa" w:w="2520"/>
+            <w:tcW w:w="1080" w:type="dxa"/>
           </w:tcPr>
           <w:p>
             <w:r>
@@ -2494,7 +2494,7 @@
         </w:tc>
         <w:tc>
           <w:tcPr>
-            <w:tcW w:type="dxa" w:w="2520"/>
+            <w:tcW w:w="1224" w:type="dxa"/>
           </w:tcPr>
           <w:p>
             <w:r>
@@ -2509,7 +2509,7 @@
         </w:tc>
         <w:tc>
           <w:tcPr>
-            <w:tcW w:type="dxa" w:w="2520"/>
+            <w:tcW w:w="1080" w:type="dxa"/>
           </w:tcPr>
           <w:p>
             <w:r>
@@ -2524,7 +2524,7 @@
         </w:tc>
         <w:tc>
           <w:tcPr>
-            <w:tcW w:type="dxa" w:w="2520"/>
+            <w:tcW w:w="1296" w:type="dxa"/>
           </w:tcPr>
           <w:p>
             <w:r>
@@ -2541,7 +2541,7 @@
       <w:tr>
         <w:tc>
           <w:tcPr>
-            <w:tcW w:type="dxa" w:w="2520"/>
+            <w:tcW w:w="1080" w:type="dxa"/>
           </w:tcPr>
           <w:p>
             <w:r>
@@ -2556,7 +2556,7 @@
         </w:tc>
         <w:tc>
           <w:tcPr>
-            <w:tcW w:type="dxa" w:w="2520"/>
+            <w:tcW w:w="1224" w:type="dxa"/>
           </w:tcPr>
           <w:p>
             <w:r>
@@ -2571,7 +2571,7 @@
         </w:tc>
         <w:tc>
           <w:tcPr>
-            <w:tcW w:type="dxa" w:w="2520"/>
+            <w:tcW w:w="1080" w:type="dxa"/>
           </w:tcPr>
           <w:p>
             <w:r>
@@ -2586,7 +2586,7 @@
         </w:tc>
         <w:tc>
           <w:tcPr>
-            <w:tcW w:type="dxa" w:w="2520"/>
+            <w:tcW w:w="1296" w:type="dxa"/>
           </w:tcPr>
           <w:p>
             <w:r>
@@ -2603,7 +2603,7 @@
       <w:tr>
         <w:tc>
           <w:tcPr>
-            <w:tcW w:type="dxa" w:w="2520"/>
+            <w:tcW w:w="1080" w:type="dxa"/>
           </w:tcPr>
           <w:p>
             <w:r>
@@ -2618,7 +2618,7 @@
         </w:tc>
         <w:tc>
           <w:tcPr>
-            <w:tcW w:type="dxa" w:w="2520"/>
+            <w:tcW w:w="1224" w:type="dxa"/>
           </w:tcPr>
           <w:p>
             <w:r>
@@ -2633,7 +2633,7 @@
         </w:tc>
         <w:tc>
           <w:tcPr>
-            <w:tcW w:type="dxa" w:w="2520"/>
+            <w:tcW w:w="1080" w:type="dxa"/>
           </w:tcPr>
           <w:p>
             <w:r>
@@ -2648,7 +2648,7 @@
         </w:tc>
         <w:tc>
           <w:tcPr>
-            <w:tcW w:type="dxa" w:w="2520"/>
+            <w:tcW w:w="1296" w:type="dxa"/>
           </w:tcPr>
           <w:p>
             <w:r>
@@ -2665,7 +2665,7 @@
       <w:tr>
         <w:tc>
           <w:tcPr>
-            <w:tcW w:type="dxa" w:w="2520"/>
+            <w:tcW w:w="1080" w:type="dxa"/>
           </w:tcPr>
           <w:p>
             <w:r>
@@ -2680,7 +2680,7 @@
         </w:tc>
         <w:tc>
           <w:tcPr>
-            <w:tcW w:type="dxa" w:w="2520"/>
+            <w:tcW w:w="1224" w:type="dxa"/>
           </w:tcPr>
           <w:p>
             <w:r>
@@ -2695,7 +2695,7 @@
         </w:tc>
         <w:tc>
           <w:tcPr>
-            <w:tcW w:type="dxa" w:w="2520"/>
+            <w:tcW w:w="1080" w:type="dxa"/>
           </w:tcPr>
           <w:p>
             <w:r>
@@ -2710,7 +2710,7 @@
         </w:tc>
         <w:tc>
           <w:tcPr>
-            <w:tcW w:type="dxa" w:w="2520"/>
+            <w:tcW w:w="1296" w:type="dxa"/>
           </w:tcPr>
           <w:p>
             <w:r>
@@ -2727,7 +2727,7 @@
       <w:tr>
         <w:tc>
           <w:tcPr>
-            <w:tcW w:type="dxa" w:w="2520"/>
+            <w:tcW w:w="1080" w:type="dxa"/>
           </w:tcPr>
           <w:p>
             <w:r>
@@ -2742,7 +2742,7 @@
         </w:tc>
         <w:tc>
           <w:tcPr>
-            <w:tcW w:type="dxa" w:w="2520"/>
+            <w:tcW w:w="1224" w:type="dxa"/>
           </w:tcPr>
           <w:p>
             <w:r>
@@ -2757,7 +2757,7 @@
         </w:tc>
         <w:tc>
           <w:tcPr>
-            <w:tcW w:type="dxa" w:w="2520"/>
+            <w:tcW w:w="1080" w:type="dxa"/>
           </w:tcPr>
           <w:p>
             <w:r>
@@ -2772,7 +2772,7 @@
         </w:tc>
         <w:tc>
           <w:tcPr>
-            <w:tcW w:type="dxa" w:w="2520"/>
+            <w:tcW w:w="1296" w:type="dxa"/>
           </w:tcPr>
           <w:p>
             <w:r>
@@ -2789,7 +2789,7 @@
       <w:tr>
         <w:tc>
           <w:tcPr>
-            <w:tcW w:type="dxa" w:w="2520"/>
+            <w:tcW w:w="1080" w:type="dxa"/>
           </w:tcPr>
           <w:p>
             <w:r>
@@ -2804,7 +2804,7 @@
         </w:tc>
         <w:tc>
           <w:tcPr>
-            <w:tcW w:type="dxa" w:w="2520"/>
+            <w:tcW w:w="1224" w:type="dxa"/>
           </w:tcPr>
           <w:p>
             <w:r>
@@ -2819,7 +2819,7 @@
         </w:tc>
         <w:tc>
           <w:tcPr>
-            <w:tcW w:type="dxa" w:w="2520"/>
+            <w:tcW w:w="1080" w:type="dxa"/>
           </w:tcPr>
           <w:p>
             <w:r>
@@ -2834,7 +2834,7 @@
         </w:tc>
         <w:tc>
           <w:tcPr>
-            <w:tcW w:type="dxa" w:w="2520"/>
+            <w:tcW w:w="1296" w:type="dxa"/>
           </w:tcPr>
           <w:p>
             <w:r>
@@ -2851,7 +2851,7 @@
       <w:tr>
         <w:tc>
           <w:tcPr>
-            <w:tcW w:type="dxa" w:w="2520"/>
+            <w:tcW w:w="1080" w:type="dxa"/>
           </w:tcPr>
           <w:p>
             <w:r>
@@ -2866,7 +2866,7 @@
         </w:tc>
         <w:tc>
           <w:tcPr>
-            <w:tcW w:type="dxa" w:w="2520"/>
+            <w:tcW w:w="1224" w:type="dxa"/>
           </w:tcPr>
           <w:p>
             <w:r>
@@ -2881,7 +2881,7 @@
         </w:tc>
         <w:tc>
           <w:tcPr>
-            <w:tcW w:type="dxa" w:w="2520"/>
+            <w:tcW w:w="1080" w:type="dxa"/>
           </w:tcPr>
           <w:p>
             <w:r>
@@ -2896,7 +2896,7 @@
         </w:tc>
         <w:tc>
           <w:tcPr>
-            <w:tcW w:type="dxa" w:w="2520"/>
+            <w:tcW w:w="1296" w:type="dxa"/>
           </w:tcPr>
           <w:p>
             <w:r>
@@ -2913,7 +2913,7 @@
       <w:tr>
         <w:tc>
           <w:tcPr>
-            <w:tcW w:type="dxa" w:w="2520"/>
+            <w:tcW w:w="1080" w:type="dxa"/>
           </w:tcPr>
           <w:p>
             <w:r>
@@ -2928,7 +2928,7 @@
         </w:tc>
         <w:tc>
           <w:tcPr>
-            <w:tcW w:type="dxa" w:w="2520"/>
+            <w:tcW w:w="1224" w:type="dxa"/>
           </w:tcPr>
           <w:p>
             <w:r>
@@ -2943,7 +2943,7 @@
         </w:tc>
         <w:tc>
           <w:tcPr>
-            <w:tcW w:type="dxa" w:w="2520"/>
+            <w:tcW w:w="1080" w:type="dxa"/>
           </w:tcPr>
           <w:p>
             <w:r>
@@ -2958,7 +2958,7 @@
         </w:tc>
         <w:tc>
           <w:tcPr>
-            <w:tcW w:type="dxa" w:w="2520"/>
+            <w:tcW w:w="1296" w:type="dxa"/>
           </w:tcPr>
           <w:p>
             <w:r>
@@ -2975,7 +2975,7 @@
       <w:tr>
         <w:tc>
           <w:tcPr>
-            <w:tcW w:type="dxa" w:w="2520"/>
+            <w:tcW w:w="1080" w:type="dxa"/>
           </w:tcPr>
           <w:p>
             <w:r>
@@ -2990,7 +2990,7 @@
         </w:tc>
         <w:tc>
           <w:tcPr>
-            <w:tcW w:type="dxa" w:w="2520"/>
+            <w:tcW w:w="1224" w:type="dxa"/>
           </w:tcPr>
           <w:p>
             <w:r>
@@ -3005,7 +3005,7 @@
         </w:tc>
         <w:tc>
           <w:tcPr>
-            <w:tcW w:type="dxa" w:w="2520"/>
+            <w:tcW w:w="1080" w:type="dxa"/>
           </w:tcPr>
           <w:p>
             <w:r>
@@ -3020,7 +3020,7 @@
         </w:tc>
         <w:tc>
           <w:tcPr>
-            <w:tcW w:type="dxa" w:w="2520"/>
+            <w:tcW w:w="1296" w:type="dxa"/>
           </w:tcPr>
           <w:p>
             <w:r>
@@ -3037,7 +3037,7 @@
       <w:tr>
         <w:tc>
           <w:tcPr>
-            <w:tcW w:type="dxa" w:w="2520"/>
+            <w:tcW w:w="1080" w:type="dxa"/>
           </w:tcPr>
           <w:p>
             <w:r>
@@ -3052,7 +3052,7 @@
         </w:tc>
         <w:tc>
           <w:tcPr>
-            <w:tcW w:type="dxa" w:w="2520"/>
+            <w:tcW w:w="1224" w:type="dxa"/>
           </w:tcPr>
           <w:p>
             <w:r>
@@ -3067,7 +3067,7 @@
         </w:tc>
         <w:tc>
           <w:tcPr>
-            <w:tcW w:type="dxa" w:w="2520"/>
+            <w:tcW w:w="1080" w:type="dxa"/>
           </w:tcPr>
           <w:p>
             <w:r>
@@ -3082,7 +3082,7 @@
         </w:tc>
         <w:tc>
           <w:tcPr>
-            <w:tcW w:type="dxa" w:w="2520"/>
+            <w:tcW w:w="1296" w:type="dxa"/>
           </w:tcPr>
           <w:p>
             <w:r>

</xml_diff>